<commit_message>
Remove section 20 and add matching PDF application
</commit_message>
<xml_diff>
--- a/documents/student-startup-shawarma.docx
+++ b/documents/student-startup-shawarma.docx
@@ -270,19 +270,6 @@
     <w:p>
       <w:r>
         <w:t>Целевые гипотезы: среднее ожидание выдачи предзаказа не более 5 минут после выбранного времени, выход на 50 заказов в день, доля списаний не более 5% стоимости закупленного сырья. Это не достигнутые показатели. Оценка цифрового модуля — сравнение сопоставимых периодов с ручным и автоматизированным планированием. Основные риски: отказ в размещении, недостаток электрической мощности, зимние расходы, низкий поток, сезонность, рост цен, ошибки пищевой безопасности и нехватка оборотных средств. Покупка оборудования допускается только после проверки площадки и финансовой модели.</w:t>
-      </w:r>
-    </w:p>
-    <w:p>
-      <w:pPr>
-        <w:pStyle w:val="Heading1"/>
-      </w:pPr>
-      <w:r>
-        <w:t>20. Что ещё требуется уточнить</w:t>
-      </w:r>
-    </w:p>
-    <w:p>
-      <w:r>
-        <w:t>Подтвердить написание ФИО, основного заявителя и распределение ролей; выбрать конкретный студгородок и предполагаемую площадку; определить навыки команды и доступные ресурсы. Для учебного документа персональные реквизиты и дополнительные справки не заполняются. Для настоящей заявки отдельно проверяются требования к заявителю, документам, технологичности, обязательным результатам и расходам. Сам по себе мобильный пункт питания не гарантирует соответствия конкурсу «Студенческий стартап».</w:t>
       </w:r>
     </w:p>
     <w:sectPr>

</xml_diff>